<commit_message>
2022-01-19 End of day file push
</commit_message>
<xml_diff>
--- a/2021-11-09 Backlog.docx
+++ b/2021-11-09 Backlog.docx
@@ -10,30 +10,20 @@
           <w:numId w:val="1"/>
         </w:numPr>
       </w:pPr>
-      <w:proofErr w:type="spellStart"/>
       <w:r>
         <w:t>SysproCompanyS</w:t>
       </w:r>
-      <w:proofErr w:type="spellEnd"/>
-    </w:p>
-    <w:p>
-      <w:pPr>
-        <w:pStyle w:val="ListParagraph"/>
-        <w:numPr>
-          <w:ilvl w:val="1"/>
-          <w:numId w:val="1"/>
-        </w:numPr>
-      </w:pPr>
-      <w:r>
-        <w:t xml:space="preserve">Mostly an exact copy of </w:t>
-      </w:r>
-      <w:proofErr w:type="spellStart"/>
-      <w:r>
-        <w:t>BWSAdmin</w:t>
-      </w:r>
-      <w:proofErr w:type="spellEnd"/>
-      <w:r>
-        <w:t xml:space="preserve"> Employee Menu. Finished except for a few hanging bugs.</w:t>
+    </w:p>
+    <w:p>
+      <w:pPr>
+        <w:pStyle w:val="ListParagraph"/>
+        <w:numPr>
+          <w:ilvl w:val="1"/>
+          <w:numId w:val="1"/>
+        </w:numPr>
+      </w:pPr>
+      <w:r>
+        <w:t>Mostly an exact copy of BWSAdmin Employee Menu. Finished except for a few hanging bugs.</w:t>
       </w:r>
     </w:p>
     <w:p>
@@ -62,15 +52,7 @@
         </w:numPr>
       </w:pPr>
       <w:r>
-        <w:t xml:space="preserve">My time spent on this has significantly decreased over the past 2 weeks. </w:t>
-      </w:r>
-      <w:proofErr w:type="gramStart"/>
-      <w:r>
-        <w:t>still</w:t>
-      </w:r>
-      <w:proofErr w:type="gramEnd"/>
-      <w:r>
-        <w:t xml:space="preserve"> normal maintenance and checks though.</w:t>
+        <w:t>My time spent on this has significantly decreased over the past 2 weeks. still normal maintenance and checks though.</w:t>
       </w:r>
     </w:p>
     <w:p>
@@ -81,111 +63,68 @@
           <w:numId w:val="1"/>
         </w:numPr>
       </w:pPr>
-      <w:proofErr w:type="spellStart"/>
       <w:r>
         <w:t>ShopClock</w:t>
       </w:r>
-      <w:proofErr w:type="spellEnd"/>
-    </w:p>
-    <w:p>
-      <w:pPr>
-        <w:pStyle w:val="ListParagraph"/>
-        <w:numPr>
-          <w:ilvl w:val="1"/>
-          <w:numId w:val="1"/>
-        </w:numPr>
-      </w:pPr>
-      <w:proofErr w:type="gramStart"/>
-      <w:r>
-        <w:t>re-implement</w:t>
-      </w:r>
-      <w:proofErr w:type="gramEnd"/>
-      <w:r>
-        <w:t xml:space="preserve"> employee hours rounding rules.</w:t>
-      </w:r>
-    </w:p>
-    <w:p>
-      <w:pPr>
-        <w:pStyle w:val="ListParagraph"/>
-        <w:numPr>
-          <w:ilvl w:val="1"/>
-          <w:numId w:val="1"/>
-        </w:numPr>
-      </w:pPr>
-      <w:proofErr w:type="gramStart"/>
-      <w:r>
-        <w:t>calculate</w:t>
-      </w:r>
-      <w:proofErr w:type="gramEnd"/>
-      <w:r>
-        <w:t xml:space="preserve"> </w:t>
-      </w:r>
-      <w:proofErr w:type="spellStart"/>
-      <w:r>
-        <w:t>labour</w:t>
-      </w:r>
-      <w:proofErr w:type="spellEnd"/>
-      <w:r>
-        <w:t xml:space="preserve"> hours.</w:t>
-      </w:r>
-    </w:p>
-    <w:p>
-      <w:pPr>
-        <w:pStyle w:val="ListParagraph"/>
-        <w:numPr>
-          <w:ilvl w:val="1"/>
-          <w:numId w:val="1"/>
-        </w:numPr>
-      </w:pPr>
-      <w:proofErr w:type="gramStart"/>
-      <w:r>
-        <w:t>create</w:t>
-      </w:r>
-      <w:proofErr w:type="gramEnd"/>
-      <w:r>
-        <w:t xml:space="preserve"> override form for foremen to check claimed </w:t>
-      </w:r>
-      <w:proofErr w:type="spellStart"/>
-      <w:r>
-        <w:t>labour</w:t>
-      </w:r>
-      <w:proofErr w:type="spellEnd"/>
-      <w:r>
-        <w:t>.</w:t>
-      </w:r>
-    </w:p>
-    <w:p>
-      <w:pPr>
-        <w:pStyle w:val="ListParagraph"/>
-        <w:numPr>
-          <w:ilvl w:val="1"/>
-          <w:numId w:val="1"/>
-        </w:numPr>
-      </w:pPr>
-      <w:proofErr w:type="gramStart"/>
-      <w:r>
-        <w:t>create</w:t>
-      </w:r>
-      <w:proofErr w:type="gramEnd"/>
-      <w:r>
-        <w:t xml:space="preserve"> shift maintenance form for payroll / foreman to adjust shifts.</w:t>
-      </w:r>
-    </w:p>
-    <w:p>
-      <w:pPr>
-        <w:pStyle w:val="ListParagraph"/>
-        <w:numPr>
-          <w:ilvl w:val="1"/>
-          <w:numId w:val="1"/>
-        </w:numPr>
-      </w:pPr>
-      <w:proofErr w:type="gramStart"/>
-      <w:r>
-        <w:t>create</w:t>
-      </w:r>
-      <w:proofErr w:type="gramEnd"/>
-      <w:r>
-        <w:t xml:space="preserve"> report to view results.</w:t>
+    </w:p>
+    <w:p>
+      <w:pPr>
+        <w:pStyle w:val="ListParagraph"/>
+        <w:numPr>
+          <w:ilvl w:val="1"/>
+          <w:numId w:val="1"/>
+        </w:numPr>
+      </w:pPr>
+      <w:r>
+        <w:t>re-implement employee hours rounding rules.</w:t>
+      </w:r>
+    </w:p>
+    <w:p>
+      <w:pPr>
+        <w:pStyle w:val="ListParagraph"/>
+        <w:numPr>
+          <w:ilvl w:val="1"/>
+          <w:numId w:val="1"/>
+        </w:numPr>
+      </w:pPr>
+      <w:r>
+        <w:t>calculate labour hours.</w:t>
+      </w:r>
+    </w:p>
+    <w:p>
+      <w:pPr>
+        <w:pStyle w:val="ListParagraph"/>
+        <w:numPr>
+          <w:ilvl w:val="1"/>
+          <w:numId w:val="1"/>
+        </w:numPr>
+      </w:pPr>
+      <w:r>
+        <w:t>create override form for foremen to check claimed labour.</w:t>
+      </w:r>
+    </w:p>
+    <w:p>
+      <w:pPr>
+        <w:pStyle w:val="ListParagraph"/>
+        <w:numPr>
+          <w:ilvl w:val="1"/>
+          <w:numId w:val="1"/>
+        </w:numPr>
+      </w:pPr>
+      <w:r>
+        <w:t>create shift maintenance form for payroll / foreman to adjust shifts.</w:t>
+      </w:r>
+    </w:p>
+    <w:p>
+      <w:pPr>
+        <w:pStyle w:val="ListParagraph"/>
+        <w:numPr>
+          <w:ilvl w:val="1"/>
+          <w:numId w:val="1"/>
+        </w:numPr>
+      </w:pPr>
+      <w:r>
+        <w:t>create report to view results.</w:t>
       </w:r>
     </w:p>
     <w:p>
@@ -202,43 +141,19 @@
         </w:numPr>
       </w:pPr>
       <w:r>
-        <w:t xml:space="preserve">Currently in-the-thick-of-it. I am designing the forms and reports on both the </w:t>
-      </w:r>
-      <w:proofErr w:type="spellStart"/>
-      <w:r>
-        <w:t>Stargate</w:t>
-      </w:r>
-      <w:proofErr w:type="spellEnd"/>
-      <w:r>
-        <w:t xml:space="preserve"> and BWS side.</w:t>
-      </w:r>
-    </w:p>
-    <w:p>
-      <w:pPr>
-        <w:pStyle w:val="ListParagraph"/>
-        <w:numPr>
-          <w:ilvl w:val="1"/>
-          <w:numId w:val="1"/>
-        </w:numPr>
-      </w:pPr>
-      <w:r>
-        <w:t xml:space="preserve">I have the logic written to calculate the payable </w:t>
-      </w:r>
-      <w:proofErr w:type="spellStart"/>
-      <w:r>
-        <w:t>labour</w:t>
-      </w:r>
-      <w:proofErr w:type="spellEnd"/>
-      <w:r>
-        <w:t xml:space="preserve">, but am still testing and manually double checking some values to </w:t>
-      </w:r>
-      <w:proofErr w:type="spellStart"/>
-      <w:r>
-        <w:t>ensuere</w:t>
-      </w:r>
-      <w:proofErr w:type="spellEnd"/>
-      <w:r>
-        <w:t xml:space="preserve"> correctness.</w:t>
+        <w:t>Currently in-the-thick-of-it. I am designing the forms and reports on both the Stargate and BWS side.</w:t>
+      </w:r>
+    </w:p>
+    <w:p>
+      <w:pPr>
+        <w:pStyle w:val="ListParagraph"/>
+        <w:numPr>
+          <w:ilvl w:val="1"/>
+          <w:numId w:val="1"/>
+        </w:numPr>
+      </w:pPr>
+      <w:r>
+        <w:t>I have the logic written to calculate the payable labour, but am still testing and manually double checking some values to ensuere correctness.</w:t>
       </w:r>
     </w:p>
     <w:p>
@@ -285,38 +200,20 @@
           <w:numId w:val="1"/>
         </w:numPr>
       </w:pPr>
-      <w:proofErr w:type="gramStart"/>
-      <w:r>
-        <w:t>design</w:t>
-      </w:r>
-      <w:proofErr w:type="gramEnd"/>
-      <w:r>
-        <w:t xml:space="preserve"> </w:t>
-      </w:r>
-      <w:proofErr w:type="spellStart"/>
-      <w:r>
-        <w:t>prioirty</w:t>
-      </w:r>
-      <w:proofErr w:type="spellEnd"/>
-      <w:r>
-        <w:t xml:space="preserve"> scheduling solution for new and incoming requests.</w:t>
-      </w:r>
-    </w:p>
-    <w:p>
-      <w:pPr>
-        <w:pStyle w:val="ListParagraph"/>
-        <w:numPr>
-          <w:ilvl w:val="1"/>
-          <w:numId w:val="1"/>
-        </w:numPr>
-      </w:pPr>
-      <w:proofErr w:type="gramStart"/>
-      <w:r>
-        <w:t>design</w:t>
-      </w:r>
-      <w:proofErr w:type="gramEnd"/>
-      <w:r>
-        <w:t xml:space="preserve"> report to view results.</w:t>
+      <w:r>
+        <w:t>design prioirty scheduling solution for new and incoming requests.</w:t>
+      </w:r>
+    </w:p>
+    <w:p>
+      <w:pPr>
+        <w:pStyle w:val="ListParagraph"/>
+        <w:numPr>
+          <w:ilvl w:val="1"/>
+          <w:numId w:val="1"/>
+        </w:numPr>
+      </w:pPr>
+      <w:r>
+        <w:t>design report to view results.</w:t>
       </w:r>
     </w:p>
     <w:p>
@@ -333,15 +230,7 @@
         </w:numPr>
       </w:pPr>
       <w:r>
-        <w:t xml:space="preserve">This project is still in the planning phase for me. I have defined some metadata, and </w:t>
-      </w:r>
-      <w:proofErr w:type="spellStart"/>
-      <w:r>
-        <w:t>potentail</w:t>
-      </w:r>
-      <w:proofErr w:type="spellEnd"/>
-      <w:r>
-        <w:t xml:space="preserve"> user </w:t>
+        <w:t xml:space="preserve">This project is still in the planning phase for me. I have defined some metadata, and potentail user </w:t>
       </w:r>
       <w:r>
         <w:t>requirements.</w:t>
@@ -468,11 +357,9 @@
           <w:numId w:val="1"/>
         </w:numPr>
       </w:pPr>
-      <w:proofErr w:type="spellStart"/>
       <w:r>
         <w:t>CADTalk</w:t>
       </w:r>
-      <w:proofErr w:type="spellEnd"/>
     </w:p>
     <w:p>
       <w:pPr>
@@ -499,6 +386,8 @@
         <w:t>Still new, have a meeting</w:t>
       </w:r>
     </w:p>
+    <w:p/>
+    <w:p/>
     <w:p/>
     <w:sectPr>
       <w:pgSz w:w="12240" w:h="15840"/>
@@ -1098,7 +987,7 @@
   <a:extraClrSchemeLst/>
   <a:extLst>
     <a:ext uri="{05A4C25C-085E-4340-85A3-A5531E510DB2}">
-      <thm15:themeFamily xmlns:thm15="http://schemas.microsoft.com/office/thememl/2012/main" xmlns="" name="Office Theme" id="{62F939B6-93AF-4DB8-9C6B-D6C7DFDC589F}" vid="{4A3C46E8-61CC-4603-A589-7422A47A8E4A}"/>
+      <thm15:themeFamily xmlns="" xmlns:thm15="http://schemas.microsoft.com/office/thememl/2012/main" name="Office Theme" id="{62F939B6-93AF-4DB8-9C6B-D6C7DFDC589F}" vid="{4A3C46E8-61CC-4603-A589-7422A47A8E4A}"/>
     </a:ext>
   </a:extLst>
 </a:theme>

</xml_diff>